<commit_message>
Resolve sensitivity-by-sex fairness flag with bootstrap CI analysis
Ran subgroup sensitivity/specificity analysis (test set, 1000 bootstrap
resamples per subgroup) across all four models. Gap is consistent in
direction (female higher than male) but 95% CIs overlap in every case,
so it is not statistically significant at current sample sizes. Updated
the midterm report's Results section accordingly and un-flagged it;
full numbers saved to 5_results/fairness/sensitivity_by_sex.csv.

Co-Authored-By: Claude Sonnet 5 <noreply@anthropic.com>
</commit_message>
<xml_diff>
--- a/2_midterm_report/Midterm_Report_CLAUDEgenerated.docx
+++ b/2_midterm_report/Midterm_Report_CLAUDEgenerated.docx
@@ -1441,26 +1441,7 @@
           <w:i w:val="0"/>
           <w:sz w:val="20"/>
         </w:rPr>
-        <w:t xml:space="preserve">(1) All models are within about 0.015 AUROC of each other; pairwise differences fall inside bootstrap confidence intervals. (2) Machine learning adds roughly 0.10 AUROC over the LACE clinical score alone. (3) Real gains came from data handling — keeping payer code and medical specialty (+0.008 AUROC), encoding administrative ID fields as categories rather than numbers, and adding patient-history features (+0.007) — not from model choice. (4) Calibrated probabilities are reliable (Brier score 0.094, expected calibration error 0.007). (5) A sensitivity gap by sex (women 0.62 vs. men 0.52) was observed and </w:t>
-      </w:r>
-      <w:r>
-        <w:rPr>
-          <w:rFonts w:ascii="Times New Roman" w:hAnsi="Times New Roman"/>
-          <w:b w:val="0"/>
-          <w:i w:val="0"/>
-          <w:sz w:val="20"/>
-          <w:highlight w:val="yellow"/>
-        </w:rPr>
-        <w:t>requires further investigation and ethical review before any use in a subgroup-specific threshold</w:t>
-      </w:r>
-      <w:r>
-        <w:rPr>
-          <w:rFonts w:ascii="Times New Roman" w:hAnsi="Times New Roman"/>
-          <w:b w:val="0"/>
-          <w:i w:val="0"/>
-          <w:sz w:val="20"/>
-        </w:rPr>
-        <w:t>.</w:t>
+        <w:t>(1) All models are within about 0.015 AUROC of each other; pairwise differences fall inside bootstrap confidence intervals. (2) Machine learning adds roughly 0.10 AUROC over the LACE clinical score alone. (3) Real gains came from data handling — keeping payer code and medical specialty (+0.008 AUROC), encoding administrative ID fields as categories rather than numbers, and adding patient-history features (+0.007) — not from model choice. (4) Calibrated probabilities are reliable (Brier score 0.094, expected calibration error 0.007). (5) Sensitivity differs by sex across all four models (ensemble: 0.603 female vs. 0.555 male), but 95% bootstrap confidence intervals overlap in every case (female [0.572, 0.635], male [0.517, 0.589]; n=8,268 female / 6,949 male, 948 / 732 positive cases), so the gap is not statistically significant at current sample sizes. The consistent direction across all four model families is worth monitoring if the model is revisited, but does not support a claim of differential performance by sex at this stage (full subgroup results: 5_results/fairness/sensitivity_by_sex.csv).</w:t>
       </w:r>
     </w:p>
     <w:p>

</xml_diff>

<commit_message>
Trim midterm report to required rubric sections only
Midterm rubric requires: problem statement/clinical motivation, literature
synthesis, quantitative dataset description, evaluation protocol, candidate
models, work plan with roles & risks (3 pages IEEE, >=15 refs). No results
section is scored at midterm. Removed the preliminary results table, the
sensitivity-by-sex findings paragraph, and the draft CRediT/Gen-AI
statements from the report; saved all of it in
2_midterm_report/material_for_final_report.md so it drops straight into the
final manuscript (due Dec 11) instead of being lost.

Co-Authored-By: Claude Sonnet 5 <noreply@anthropic.com>
</commit_message>
<xml_diff>
--- a/2_midterm_report/Midterm_Report_CLAUDEgenerated.docx
+++ b/2_midterm_report/Midterm_Report_CLAUDEgenerated.docx
@@ -526,7 +526,7 @@
           <w:i w:val="0"/>
           <w:sz w:val="22"/>
         </w:rPr>
-        <w:t>V. Candidate Models and Preliminary Results</w:t>
+        <w:t>V. Candidate Models</w:t>
       </w:r>
     </w:p>
     <w:p>
@@ -540,908 +540,7 @@
           <w:i w:val="0"/>
           <w:sz w:val="20"/>
         </w:rPr>
-        <w:t>Candidates: a trivial baseline (majority class); regularised logistic regression; two gradient-boosting implementations (XGBoost, CatBoost — CatBoost handles our categorical features natively rather than via one-hot encoding); a multilayer perceptron; a validation-weighted ensemble of the above; and the LACE score as a clinical benchmark. The choice of families follows evidence that boosted trees remain strong on medium-sized tabular data, with a deep model included to test that claim directly on our data [18].</w:t>
-      </w:r>
-    </w:p>
-    <w:p>
-      <w:pPr>
-        <w:spacing w:after="80"/>
-      </w:pPr>
-      <w:r>
-        <w:rPr>
-          <w:rFonts w:ascii="Times New Roman" w:hAnsi="Times New Roman"/>
-          <w:b/>
-          <w:i w:val="0"/>
-          <w:sz w:val="16"/>
-        </w:rPr>
-        <w:t>TABLE I. PRELIMINARY TEST RESULTS (14,913 stays; always-“no” accuracy = 0.889)</w:t>
-      </w:r>
-    </w:p>
-    <w:tbl>
-      <w:tblPr>
-        <w:tblStyle w:val="LightGrid-Accent1"/>
-        <w:tblW w:type="auto" w:w="0"/>
-        <w:tblLook w:firstColumn="1" w:firstRow="1" w:lastColumn="0" w:lastRow="0" w:noHBand="0" w:noVBand="1" w:val="04A0"/>
-      </w:tblPr>
-      <w:tblGrid>
-        <w:gridCol w:w="1680"/>
-        <w:gridCol w:w="1680"/>
-        <w:gridCol w:w="1680"/>
-        <w:gridCol w:w="1680"/>
-        <w:gridCol w:w="1680"/>
-        <w:gridCol w:w="1680"/>
-      </w:tblGrid>
-      <w:tr>
-        <w:tc>
-          <w:tcPr>
-            <w:tcW w:type="dxa" w:w="1680"/>
-          </w:tcPr>
-          <w:p>
-            <w:pPr>
-              <w:jc w:val="center"/>
-            </w:pPr>
-            <w:r/>
-            <w:r>
-              <w:rPr>
-                <w:rFonts w:ascii="Times New Roman" w:hAnsi="Times New Roman"/>
-                <w:b/>
-                <w:sz w:val="16"/>
-              </w:rPr>
-              <w:t>Model</w:t>
-            </w:r>
-          </w:p>
-        </w:tc>
-        <w:tc>
-          <w:tcPr>
-            <w:tcW w:type="dxa" w:w="1680"/>
-          </w:tcPr>
-          <w:p>
-            <w:pPr>
-              <w:jc w:val="center"/>
-            </w:pPr>
-            <w:r/>
-            <w:r>
-              <w:rPr>
-                <w:rFonts w:ascii="Times New Roman" w:hAnsi="Times New Roman"/>
-                <w:b/>
-                <w:sz w:val="16"/>
-              </w:rPr>
-              <w:t>AUROC</w:t>
-            </w:r>
-          </w:p>
-        </w:tc>
-        <w:tc>
-          <w:tcPr>
-            <w:tcW w:type="dxa" w:w="1680"/>
-          </w:tcPr>
-          <w:p>
-            <w:pPr>
-              <w:jc w:val="center"/>
-            </w:pPr>
-            <w:r/>
-            <w:r>
-              <w:rPr>
-                <w:rFonts w:ascii="Times New Roman" w:hAnsi="Times New Roman"/>
-                <w:b/>
-                <w:sz w:val="16"/>
-              </w:rPr>
-              <w:t>AUPRC</w:t>
-            </w:r>
-          </w:p>
-        </w:tc>
-        <w:tc>
-          <w:tcPr>
-            <w:tcW w:type="dxa" w:w="1680"/>
-          </w:tcPr>
-          <w:p>
-            <w:pPr>
-              <w:jc w:val="center"/>
-            </w:pPr>
-            <w:r/>
-            <w:r>
-              <w:rPr>
-                <w:rFonts w:ascii="Times New Roman" w:hAnsi="Times New Roman"/>
-                <w:b/>
-                <w:sz w:val="16"/>
-              </w:rPr>
-              <w:t>Acc.</w:t>
-            </w:r>
-          </w:p>
-        </w:tc>
-        <w:tc>
-          <w:tcPr>
-            <w:tcW w:type="dxa" w:w="1680"/>
-          </w:tcPr>
-          <w:p>
-            <w:pPr>
-              <w:jc w:val="center"/>
-            </w:pPr>
-            <w:r/>
-            <w:r>
-              <w:rPr>
-                <w:rFonts w:ascii="Times New Roman" w:hAnsi="Times New Roman"/>
-                <w:b/>
-                <w:sz w:val="16"/>
-              </w:rPr>
-              <w:t>Sens.</w:t>
-            </w:r>
-          </w:p>
-        </w:tc>
-        <w:tc>
-          <w:tcPr>
-            <w:tcW w:type="dxa" w:w="1680"/>
-          </w:tcPr>
-          <w:p>
-            <w:pPr>
-              <w:jc w:val="center"/>
-            </w:pPr>
-            <w:r/>
-            <w:r>
-              <w:rPr>
-                <w:rFonts w:ascii="Times New Roman" w:hAnsi="Times New Roman"/>
-                <w:b/>
-                <w:sz w:val="16"/>
-              </w:rPr>
-              <w:t>Spec.</w:t>
-            </w:r>
-          </w:p>
-        </w:tc>
-      </w:tr>
-      <w:tr>
-        <w:tc>
-          <w:tcPr>
-            <w:tcW w:type="dxa" w:w="1680"/>
-          </w:tcPr>
-          <w:p>
-            <w:pPr>
-              <w:jc w:val="left"/>
-            </w:pPr>
-            <w:r>
-              <w:rPr>
-                <w:rFonts w:ascii="Times New Roman" w:hAnsi="Times New Roman"/>
-                <w:sz w:val="16"/>
-              </w:rPr>
-              <w:t>Baseline (majority)</w:t>
-            </w:r>
-          </w:p>
-        </w:tc>
-        <w:tc>
-          <w:tcPr>
-            <w:tcW w:type="dxa" w:w="1680"/>
-          </w:tcPr>
-          <w:p>
-            <w:pPr>
-              <w:jc w:val="center"/>
-            </w:pPr>
-            <w:r>
-              <w:rPr>
-                <w:rFonts w:ascii="Times New Roman" w:hAnsi="Times New Roman"/>
-                <w:sz w:val="16"/>
-              </w:rPr>
-              <w:t>0.500</w:t>
-            </w:r>
-          </w:p>
-        </w:tc>
-        <w:tc>
-          <w:tcPr>
-            <w:tcW w:type="dxa" w:w="1680"/>
-          </w:tcPr>
-          <w:p>
-            <w:pPr>
-              <w:jc w:val="center"/>
-            </w:pPr>
-            <w:r>
-              <w:rPr>
-                <w:rFonts w:ascii="Times New Roman" w:hAnsi="Times New Roman"/>
-                <w:sz w:val="16"/>
-              </w:rPr>
-              <w:t>0.111</w:t>
-            </w:r>
-          </w:p>
-        </w:tc>
-        <w:tc>
-          <w:tcPr>
-            <w:tcW w:type="dxa" w:w="1680"/>
-          </w:tcPr>
-          <w:p>
-            <w:pPr>
-              <w:jc w:val="center"/>
-            </w:pPr>
-            <w:r>
-              <w:rPr>
-                <w:rFonts w:ascii="Times New Roman" w:hAnsi="Times New Roman"/>
-                <w:sz w:val="16"/>
-              </w:rPr>
-              <w:t>0.889</w:t>
-            </w:r>
-          </w:p>
-        </w:tc>
-        <w:tc>
-          <w:tcPr>
-            <w:tcW w:type="dxa" w:w="1680"/>
-          </w:tcPr>
-          <w:p>
-            <w:pPr>
-              <w:jc w:val="center"/>
-            </w:pPr>
-            <w:r>
-              <w:rPr>
-                <w:rFonts w:ascii="Times New Roman" w:hAnsi="Times New Roman"/>
-                <w:sz w:val="16"/>
-              </w:rPr>
-              <w:t>0.000</w:t>
-            </w:r>
-          </w:p>
-        </w:tc>
-        <w:tc>
-          <w:tcPr>
-            <w:tcW w:type="dxa" w:w="1680"/>
-          </w:tcPr>
-          <w:p>
-            <w:pPr>
-              <w:jc w:val="center"/>
-            </w:pPr>
-            <w:r>
-              <w:rPr>
-                <w:rFonts w:ascii="Times New Roman" w:hAnsi="Times New Roman"/>
-                <w:sz w:val="16"/>
-              </w:rPr>
-              <w:t>1.000</w:t>
-            </w:r>
-          </w:p>
-        </w:tc>
-      </w:tr>
-      <w:tr>
-        <w:tc>
-          <w:tcPr>
-            <w:tcW w:type="dxa" w:w="1680"/>
-          </w:tcPr>
-          <w:p>
-            <w:pPr>
-              <w:jc w:val="left"/>
-            </w:pPr>
-            <w:r>
-              <w:rPr>
-                <w:rFonts w:ascii="Times New Roman" w:hAnsi="Times New Roman"/>
-                <w:sz w:val="16"/>
-              </w:rPr>
-              <w:t>Logistic Regression</w:t>
-            </w:r>
-          </w:p>
-        </w:tc>
-        <w:tc>
-          <w:tcPr>
-            <w:tcW w:type="dxa" w:w="1680"/>
-          </w:tcPr>
-          <w:p>
-            <w:pPr>
-              <w:jc w:val="center"/>
-            </w:pPr>
-            <w:r>
-              <w:rPr>
-                <w:rFonts w:ascii="Times New Roman" w:hAnsi="Times New Roman"/>
-                <w:sz w:val="16"/>
-              </w:rPr>
-              <w:t>0.668</w:t>
-            </w:r>
-          </w:p>
-        </w:tc>
-        <w:tc>
-          <w:tcPr>
-            <w:tcW w:type="dxa" w:w="1680"/>
-          </w:tcPr>
-          <w:p>
-            <w:pPr>
-              <w:jc w:val="center"/>
-            </w:pPr>
-            <w:r>
-              <w:rPr>
-                <w:rFonts w:ascii="Times New Roman" w:hAnsi="Times New Roman"/>
-                <w:sz w:val="16"/>
-              </w:rPr>
-              <w:t>0.214</w:t>
-            </w:r>
-          </w:p>
-        </w:tc>
-        <w:tc>
-          <w:tcPr>
-            <w:tcW w:type="dxa" w:w="1680"/>
-          </w:tcPr>
-          <w:p>
-            <w:pPr>
-              <w:jc w:val="center"/>
-            </w:pPr>
-            <w:r>
-              <w:rPr>
-                <w:rFonts w:ascii="Times New Roman" w:hAnsi="Times New Roman"/>
-                <w:sz w:val="16"/>
-              </w:rPr>
-              <w:t>0.670</w:t>
-            </w:r>
-          </w:p>
-        </w:tc>
-        <w:tc>
-          <w:tcPr>
-            <w:tcW w:type="dxa" w:w="1680"/>
-          </w:tcPr>
-          <w:p>
-            <w:pPr>
-              <w:jc w:val="center"/>
-            </w:pPr>
-            <w:r>
-              <w:rPr>
-                <w:rFonts w:ascii="Times New Roman" w:hAnsi="Times New Roman"/>
-                <w:sz w:val="16"/>
-              </w:rPr>
-              <w:t>0.547</w:t>
-            </w:r>
-          </w:p>
-        </w:tc>
-        <w:tc>
-          <w:tcPr>
-            <w:tcW w:type="dxa" w:w="1680"/>
-          </w:tcPr>
-          <w:p>
-            <w:pPr>
-              <w:jc w:val="center"/>
-            </w:pPr>
-            <w:r>
-              <w:rPr>
-                <w:rFonts w:ascii="Times New Roman" w:hAnsi="Times New Roman"/>
-                <w:sz w:val="16"/>
-              </w:rPr>
-              <w:t>0.685</w:t>
-            </w:r>
-          </w:p>
-        </w:tc>
-      </w:tr>
-      <w:tr>
-        <w:tc>
-          <w:tcPr>
-            <w:tcW w:type="dxa" w:w="1680"/>
-          </w:tcPr>
-          <w:p>
-            <w:pPr>
-              <w:jc w:val="left"/>
-            </w:pPr>
-            <w:r>
-              <w:rPr>
-                <w:rFonts w:ascii="Times New Roman" w:hAnsi="Times New Roman"/>
-                <w:sz w:val="16"/>
-              </w:rPr>
-              <w:t>XGBoost</w:t>
-            </w:r>
-          </w:p>
-        </w:tc>
-        <w:tc>
-          <w:tcPr>
-            <w:tcW w:type="dxa" w:w="1680"/>
-          </w:tcPr>
-          <w:p>
-            <w:pPr>
-              <w:jc w:val="center"/>
-            </w:pPr>
-            <w:r>
-              <w:rPr>
-                <w:rFonts w:ascii="Times New Roman" w:hAnsi="Times New Roman"/>
-                <w:sz w:val="16"/>
-              </w:rPr>
-              <w:t>0.672</w:t>
-            </w:r>
-          </w:p>
-        </w:tc>
-        <w:tc>
-          <w:tcPr>
-            <w:tcW w:type="dxa" w:w="1680"/>
-          </w:tcPr>
-          <w:p>
-            <w:pPr>
-              <w:jc w:val="center"/>
-            </w:pPr>
-            <w:r>
-              <w:rPr>
-                <w:rFonts w:ascii="Times New Roman" w:hAnsi="Times New Roman"/>
-                <w:sz w:val="16"/>
-              </w:rPr>
-              <w:t>0.226</w:t>
-            </w:r>
-          </w:p>
-        </w:tc>
-        <w:tc>
-          <w:tcPr>
-            <w:tcW w:type="dxa" w:w="1680"/>
-          </w:tcPr>
-          <w:p>
-            <w:pPr>
-              <w:jc w:val="center"/>
-            </w:pPr>
-            <w:r>
-              <w:rPr>
-                <w:rFonts w:ascii="Times New Roman" w:hAnsi="Times New Roman"/>
-                <w:sz w:val="16"/>
-              </w:rPr>
-              <w:t>0.682</w:t>
-            </w:r>
-          </w:p>
-        </w:tc>
-        <w:tc>
-          <w:tcPr>
-            <w:tcW w:type="dxa" w:w="1680"/>
-          </w:tcPr>
-          <w:p>
-            <w:pPr>
-              <w:jc w:val="center"/>
-            </w:pPr>
-            <w:r>
-              <w:rPr>
-                <w:rFonts w:ascii="Times New Roman" w:hAnsi="Times New Roman"/>
-                <w:sz w:val="16"/>
-              </w:rPr>
-              <w:t>0.539</w:t>
-            </w:r>
-          </w:p>
-        </w:tc>
-        <w:tc>
-          <w:tcPr>
-            <w:tcW w:type="dxa" w:w="1680"/>
-          </w:tcPr>
-          <w:p>
-            <w:pPr>
-              <w:jc w:val="center"/>
-            </w:pPr>
-            <w:r>
-              <w:rPr>
-                <w:rFonts w:ascii="Times New Roman" w:hAnsi="Times New Roman"/>
-                <w:sz w:val="16"/>
-              </w:rPr>
-              <w:t>0.700</w:t>
-            </w:r>
-          </w:p>
-        </w:tc>
-      </w:tr>
-      <w:tr>
-        <w:tc>
-          <w:tcPr>
-            <w:tcW w:type="dxa" w:w="1680"/>
-          </w:tcPr>
-          <w:p>
-            <w:pPr>
-              <w:jc w:val="left"/>
-            </w:pPr>
-            <w:r>
-              <w:rPr>
-                <w:rFonts w:ascii="Times New Roman" w:hAnsi="Times New Roman"/>
-                <w:sz w:val="16"/>
-              </w:rPr>
-              <w:t>CatBoost</w:t>
-            </w:r>
-          </w:p>
-        </w:tc>
-        <w:tc>
-          <w:tcPr>
-            <w:tcW w:type="dxa" w:w="1680"/>
-          </w:tcPr>
-          <w:p>
-            <w:pPr>
-              <w:jc w:val="center"/>
-            </w:pPr>
-            <w:r>
-              <w:rPr>
-                <w:rFonts w:ascii="Times New Roman" w:hAnsi="Times New Roman"/>
-                <w:sz w:val="16"/>
-              </w:rPr>
-              <w:t>0.677</w:t>
-            </w:r>
-          </w:p>
-        </w:tc>
-        <w:tc>
-          <w:tcPr>
-            <w:tcW w:type="dxa" w:w="1680"/>
-          </w:tcPr>
-          <w:p>
-            <w:pPr>
-              <w:jc w:val="center"/>
-            </w:pPr>
-            <w:r>
-              <w:rPr>
-                <w:rFonts w:ascii="Times New Roman" w:hAnsi="Times New Roman"/>
-                <w:sz w:val="16"/>
-              </w:rPr>
-              <w:t>0.228</w:t>
-            </w:r>
-          </w:p>
-        </w:tc>
-        <w:tc>
-          <w:tcPr>
-            <w:tcW w:type="dxa" w:w="1680"/>
-          </w:tcPr>
-          <w:p>
-            <w:pPr>
-              <w:jc w:val="center"/>
-            </w:pPr>
-            <w:r>
-              <w:rPr>
-                <w:rFonts w:ascii="Times New Roman" w:hAnsi="Times New Roman"/>
-                <w:sz w:val="16"/>
-              </w:rPr>
-              <w:t>0.671</w:t>
-            </w:r>
-          </w:p>
-        </w:tc>
-        <w:tc>
-          <w:tcPr>
-            <w:tcW w:type="dxa" w:w="1680"/>
-          </w:tcPr>
-          <w:p>
-            <w:pPr>
-              <w:jc w:val="center"/>
-            </w:pPr>
-            <w:r>
-              <w:rPr>
-                <w:rFonts w:ascii="Times New Roman" w:hAnsi="Times New Roman"/>
-                <w:sz w:val="16"/>
-              </w:rPr>
-              <w:t>0.555</w:t>
-            </w:r>
-          </w:p>
-        </w:tc>
-        <w:tc>
-          <w:tcPr>
-            <w:tcW w:type="dxa" w:w="1680"/>
-          </w:tcPr>
-          <w:p>
-            <w:pPr>
-              <w:jc w:val="center"/>
-            </w:pPr>
-            <w:r>
-              <w:rPr>
-                <w:rFonts w:ascii="Times New Roman" w:hAnsi="Times New Roman"/>
-                <w:sz w:val="16"/>
-              </w:rPr>
-              <w:t>0.685</w:t>
-            </w:r>
-          </w:p>
-        </w:tc>
-      </w:tr>
-      <w:tr>
-        <w:tc>
-          <w:tcPr>
-            <w:tcW w:type="dxa" w:w="1680"/>
-          </w:tcPr>
-          <w:p>
-            <w:pPr>
-              <w:jc w:val="left"/>
-            </w:pPr>
-            <w:r>
-              <w:rPr>
-                <w:rFonts w:ascii="Times New Roman" w:hAnsi="Times New Roman"/>
-                <w:sz w:val="16"/>
-              </w:rPr>
-              <w:t>MLP (deep learning)</w:t>
-            </w:r>
-          </w:p>
-        </w:tc>
-        <w:tc>
-          <w:tcPr>
-            <w:tcW w:type="dxa" w:w="1680"/>
-          </w:tcPr>
-          <w:p>
-            <w:pPr>
-              <w:jc w:val="center"/>
-            </w:pPr>
-            <w:r>
-              <w:rPr>
-                <w:rFonts w:ascii="Times New Roman" w:hAnsi="Times New Roman"/>
-                <w:sz w:val="16"/>
-              </w:rPr>
-              <w:t>0.668</w:t>
-            </w:r>
-          </w:p>
-        </w:tc>
-        <w:tc>
-          <w:tcPr>
-            <w:tcW w:type="dxa" w:w="1680"/>
-          </w:tcPr>
-          <w:p>
-            <w:pPr>
-              <w:jc w:val="center"/>
-            </w:pPr>
-            <w:r>
-              <w:rPr>
-                <w:rFonts w:ascii="Times New Roman" w:hAnsi="Times New Roman"/>
-                <w:sz w:val="16"/>
-              </w:rPr>
-              <w:t>0.222</w:t>
-            </w:r>
-          </w:p>
-        </w:tc>
-        <w:tc>
-          <w:tcPr>
-            <w:tcW w:type="dxa" w:w="1680"/>
-          </w:tcPr>
-          <w:p>
-            <w:pPr>
-              <w:jc w:val="center"/>
-            </w:pPr>
-            <w:r>
-              <w:rPr>
-                <w:rFonts w:ascii="Times New Roman" w:hAnsi="Times New Roman"/>
-                <w:sz w:val="16"/>
-              </w:rPr>
-              <w:t>0.616</w:t>
-            </w:r>
-          </w:p>
-        </w:tc>
-        <w:tc>
-          <w:tcPr>
-            <w:tcW w:type="dxa" w:w="1680"/>
-          </w:tcPr>
-          <w:p>
-            <w:pPr>
-              <w:jc w:val="center"/>
-            </w:pPr>
-            <w:r>
-              <w:rPr>
-                <w:rFonts w:ascii="Times New Roman" w:hAnsi="Times New Roman"/>
-                <w:sz w:val="16"/>
-              </w:rPr>
-              <w:t>0.617</w:t>
-            </w:r>
-          </w:p>
-        </w:tc>
-        <w:tc>
-          <w:tcPr>
-            <w:tcW w:type="dxa" w:w="1680"/>
-          </w:tcPr>
-          <w:p>
-            <w:pPr>
-              <w:jc w:val="center"/>
-            </w:pPr>
-            <w:r>
-              <w:rPr>
-                <w:rFonts w:ascii="Times New Roman" w:hAnsi="Times New Roman"/>
-                <w:sz w:val="16"/>
-              </w:rPr>
-              <w:t>0.616</w:t>
-            </w:r>
-          </w:p>
-        </w:tc>
-      </w:tr>
-      <w:tr>
-        <w:tc>
-          <w:tcPr>
-            <w:tcW w:type="dxa" w:w="1680"/>
-          </w:tcPr>
-          <w:p>
-            <w:pPr>
-              <w:jc w:val="left"/>
-            </w:pPr>
-            <w:r>
-              <w:rPr>
-                <w:rFonts w:ascii="Times New Roman" w:hAnsi="Times New Roman"/>
-                <w:sz w:val="16"/>
-              </w:rPr>
-              <w:t>Ensemble (blend)</w:t>
-            </w:r>
-          </w:p>
-        </w:tc>
-        <w:tc>
-          <w:tcPr>
-            <w:tcW w:type="dxa" w:w="1680"/>
-          </w:tcPr>
-          <w:p>
-            <w:pPr>
-              <w:jc w:val="center"/>
-            </w:pPr>
-            <w:r>
-              <w:rPr>
-                <w:rFonts w:ascii="Times New Roman" w:hAnsi="Times New Roman"/>
-                <w:sz w:val="16"/>
-              </w:rPr>
-              <w:t>0.676</w:t>
-            </w:r>
-          </w:p>
-        </w:tc>
-        <w:tc>
-          <w:tcPr>
-            <w:tcW w:type="dxa" w:w="1680"/>
-          </w:tcPr>
-          <w:p>
-            <w:pPr>
-              <w:jc w:val="center"/>
-            </w:pPr>
-            <w:r>
-              <w:rPr>
-                <w:rFonts w:ascii="Times New Roman" w:hAnsi="Times New Roman"/>
-                <w:sz w:val="16"/>
-              </w:rPr>
-              <w:t>0.228</w:t>
-            </w:r>
-          </w:p>
-        </w:tc>
-        <w:tc>
-          <w:tcPr>
-            <w:tcW w:type="dxa" w:w="1680"/>
-          </w:tcPr>
-          <w:p>
-            <w:pPr>
-              <w:jc w:val="center"/>
-            </w:pPr>
-            <w:r>
-              <w:rPr>
-                <w:rFonts w:ascii="Times New Roman" w:hAnsi="Times New Roman"/>
-                <w:sz w:val="16"/>
-              </w:rPr>
-              <w:t>0.674</w:t>
-            </w:r>
-          </w:p>
-        </w:tc>
-        <w:tc>
-          <w:tcPr>
-            <w:tcW w:type="dxa" w:w="1680"/>
-          </w:tcPr>
-          <w:p>
-            <w:pPr>
-              <w:jc w:val="center"/>
-            </w:pPr>
-            <w:r>
-              <w:rPr>
-                <w:rFonts w:ascii="Times New Roman" w:hAnsi="Times New Roman"/>
-                <w:sz w:val="16"/>
-              </w:rPr>
-              <w:t>0.560</w:t>
-            </w:r>
-          </w:p>
-        </w:tc>
-        <w:tc>
-          <w:tcPr>
-            <w:tcW w:type="dxa" w:w="1680"/>
-          </w:tcPr>
-          <w:p>
-            <w:pPr>
-              <w:jc w:val="center"/>
-            </w:pPr>
-            <w:r>
-              <w:rPr>
-                <w:rFonts w:ascii="Times New Roman" w:hAnsi="Times New Roman"/>
-                <w:sz w:val="16"/>
-              </w:rPr>
-              <w:t>0.688</w:t>
-            </w:r>
-          </w:p>
-        </w:tc>
-      </w:tr>
-      <w:tr>
-        <w:tc>
-          <w:tcPr>
-            <w:tcW w:type="dxa" w:w="1680"/>
-          </w:tcPr>
-          <w:p>
-            <w:pPr>
-              <w:jc w:val="left"/>
-            </w:pPr>
-            <w:r>
-              <w:rPr>
-                <w:rFonts w:ascii="Times New Roman" w:hAnsi="Times New Roman"/>
-                <w:sz w:val="16"/>
-              </w:rPr>
-              <w:t>LACE score alone</w:t>
-            </w:r>
-          </w:p>
-        </w:tc>
-        <w:tc>
-          <w:tcPr>
-            <w:tcW w:type="dxa" w:w="1680"/>
-          </w:tcPr>
-          <w:p>
-            <w:pPr>
-              <w:jc w:val="center"/>
-            </w:pPr>
-            <w:r>
-              <w:rPr>
-                <w:rFonts w:ascii="Times New Roman" w:hAnsi="Times New Roman"/>
-                <w:sz w:val="16"/>
-              </w:rPr>
-              <w:t>0.575</w:t>
-            </w:r>
-          </w:p>
-        </w:tc>
-        <w:tc>
-          <w:tcPr>
-            <w:tcW w:type="dxa" w:w="1680"/>
-          </w:tcPr>
-          <w:p>
-            <w:pPr>
-              <w:jc w:val="center"/>
-            </w:pPr>
-            <w:r>
-              <w:rPr>
-                <w:rFonts w:ascii="Times New Roman" w:hAnsi="Times New Roman"/>
-                <w:sz w:val="16"/>
-              </w:rPr>
-              <w:t>0.139</w:t>
-            </w:r>
-          </w:p>
-        </w:tc>
-        <w:tc>
-          <w:tcPr>
-            <w:tcW w:type="dxa" w:w="1680"/>
-          </w:tcPr>
-          <w:p>
-            <w:pPr>
-              <w:jc w:val="center"/>
-            </w:pPr>
-            <w:r>
-              <w:rPr>
-                <w:rFonts w:ascii="Times New Roman" w:hAnsi="Times New Roman"/>
-                <w:sz w:val="16"/>
-              </w:rPr>
-              <w:t>0.642</w:t>
-            </w:r>
-          </w:p>
-        </w:tc>
-        <w:tc>
-          <w:tcPr>
-            <w:tcW w:type="dxa" w:w="1680"/>
-          </w:tcPr>
-          <w:p>
-            <w:pPr>
-              <w:jc w:val="center"/>
-            </w:pPr>
-            <w:r>
-              <w:rPr>
-                <w:rFonts w:ascii="Times New Roman" w:hAnsi="Times New Roman"/>
-                <w:sz w:val="16"/>
-              </w:rPr>
-              <w:t>0.435</w:t>
-            </w:r>
-          </w:p>
-        </w:tc>
-        <w:tc>
-          <w:tcPr>
-            <w:tcW w:type="dxa" w:w="1680"/>
-          </w:tcPr>
-          <w:p>
-            <w:pPr>
-              <w:jc w:val="center"/>
-            </w:pPr>
-            <w:r>
-              <w:rPr>
-                <w:rFonts w:ascii="Times New Roman" w:hAnsi="Times New Roman"/>
-                <w:sz w:val="16"/>
-              </w:rPr>
-              <w:t>0.668</w:t>
-            </w:r>
-          </w:p>
-        </w:tc>
-      </w:tr>
-    </w:tbl>
-    <w:p>
-      <w:pPr>
-        <w:spacing w:after="120"/>
-      </w:pPr>
-    </w:p>
-    <w:p>
-      <w:pPr>
-        <w:spacing w:after="160"/>
-      </w:pPr>
-      <w:r>
-        <w:rPr>
-          <w:rFonts w:ascii="Times New Roman" w:hAnsi="Times New Roman"/>
-          <w:b/>
-          <w:i w:val="0"/>
-          <w:sz w:val="20"/>
-        </w:rPr>
-        <w:t xml:space="preserve">Findings so far. </w:t>
-      </w:r>
-      <w:r>
-        <w:rPr>
-          <w:rFonts w:ascii="Times New Roman" w:hAnsi="Times New Roman"/>
-          <w:b w:val="0"/>
-          <w:i w:val="0"/>
-          <w:sz w:val="20"/>
-        </w:rPr>
-        <w:t>(1) All models are within about 0.015 AUROC of each other; pairwise differences fall inside bootstrap confidence intervals. (2) Machine learning adds roughly 0.10 AUROC over the LACE clinical score alone. (3) Real gains came from data handling — keeping payer code and medical specialty (+0.008 AUROC), encoding administrative ID fields as categories rather than numbers, and adding patient-history features (+0.007) — not from model choice. (4) Calibrated probabilities are reliable (Brier score 0.094, expected calibration error 0.007). (5) Sensitivity differs by sex across all four models (ensemble: 0.603 female vs. 0.555 male), but 95% bootstrap confidence intervals overlap in every case (female [0.572, 0.635], male [0.517, 0.589]; n=8,268 female / 6,949 male, 948 / 732 positive cases), so the gap is not statistically significant at current sample sizes. The consistent direction across all four model families is worth monitoring if the model is revisited, but does not support a claim of differential performance by sex at this stage (full subgroup results: 5_results/fairness/sensitivity_by_sex.csv).</w:t>
+        <w:t>Candidates: a trivial baseline (majority class); regularised logistic regression; two gradient-boosting implementations (XGBoost, CatBoost — CatBoost handles our categorical features natively rather than via one-hot encoding); a multilayer perceptron; a validation-weighted ensemble of the above; and the LACE score as a clinical benchmark. The choice of families follows evidence that boosted trees remain strong on medium-sized tabular data, with a deep model included to test that claim directly on our data [18]. Training, evaluation, calibration and subgroup-fairness code for all candidates is implemented and runs end-to-end on the patient-level splits described in Sec. IV; full results will be reported in the final manuscript once the evaluation protocol is finalised.</w:t>
       </w:r>
     </w:p>
     <w:p>
@@ -1786,7 +885,7 @@
           <w:i w:val="0"/>
           <w:sz w:val="20"/>
         </w:rPr>
-        <w:t>(a) Limited information: performance is held to roughly 0.68–0.70 AUROC by the recorded variables (a learning curve shows only about +0.005 AUROC per doubling of training data for boosted trees, and none for simpler models), so the project's contribution is methodological rigour, not raw accuracy. (b) Data age and single-country origin limit generalisability; no external validation set is available. (c) Small subgroups cannot be assessed reliably. (d) Time: verified contributions and read references from every member are needed before the deadlines. (e) Metric misreading: mitigated by always reporting sensitivity alongside accuracy.</w:t>
+        <w:t>(a) Limited information: performance is expected to be bounded by the recorded variables, so the project's contribution is methodological rigour, not raw accuracy. (b) Data age and single-country origin limit generalisability; no external validation set is available. (c) Time: verified contributions and read references from every member are needed before the deadlines. (d) Metric misreading: mitigated by always reporting sensitivity and specificity alongside accuracy.</w:t>
       </w:r>
     </w:p>
     <w:p>
@@ -2413,68 +1512,6 @@
         <w:t>NOTE TO TEAM: every reference above is highlighted because none has yet been confirmed read by a human team member — this is a hard requirement of the rubric (“Every reference must have been read by at least one team member”) and graders may ask about specific citations. Pre-screened full texts are available in 4_benchmarking/LARISSA/papers/ and 4_benchmarking/papers/. Please read your assigned subset, correct any misreading, and remove this note and the per-reference flags once done.</w:t>
       </w:r>
     </w:p>
-    <w:p>
-      <w:pPr>
-        <w:spacing w:after="120" w:before="200"/>
-      </w:pPr>
-      <w:r>
-        <w:rPr>
-          <w:rFonts w:ascii="Times New Roman" w:hAnsi="Times New Roman"/>
-          <w:b/>
-          <w:i w:val="0"/>
-          <w:sz w:val="20"/>
-        </w:rPr>
-        <w:t>Statements (not counted toward the page limit)</w:t>
-      </w:r>
-    </w:p>
-    <w:p>
-      <w:pPr>
-        <w:spacing w:after="160"/>
-      </w:pPr>
-      <w:r>
-        <w:rPr>
-          <w:rFonts w:ascii="Times New Roman" w:hAnsi="Times New Roman"/>
-          <w:b/>
-          <w:i w:val="0"/>
-          <w:sz w:val="18"/>
-        </w:rPr>
-        <w:t xml:space="preserve">CRediT contribution statement (DRAFT): </w:t>
-      </w:r>
-      <w:r>
-        <w:rPr>
-          <w:rFonts w:ascii="Times New Roman" w:hAnsi="Times New Roman"/>
-          <w:b w:val="0"/>
-          <w:i w:val="0"/>
-          <w:sz w:val="18"/>
-          <w:highlight w:val="yellow"/>
-        </w:rPr>
-        <w:t>Conceptualization — S. Khaldoun, K. Arab; Data curation, Methodology, Software, Validation, Formal analysis, Investigation — S. Khaldoun; Investigation (literature) — K. Arab, L. Chiu (in progress), M. Achim (TBD); Writing, original draft — S. Khaldoun, K. Arab; Writing, review and editing — TBD; Project administration — S. Khaldoun, K. Arab. EACH TEAM MEMBER MUST REVIEW AND CORRECT THEIR OWN LINE BEFORE SUBMISSION — full draft table in 6_project_progress/statements.md.</w:t>
-      </w:r>
-    </w:p>
-    <w:p>
-      <w:pPr>
-        <w:spacing w:after="160"/>
-      </w:pPr>
-      <w:r>
-        <w:rPr>
-          <w:rFonts w:ascii="Times New Roman" w:hAnsi="Times New Roman"/>
-          <w:b/>
-          <w:i w:val="0"/>
-          <w:sz w:val="18"/>
-        </w:rPr>
-        <w:t xml:space="preserve">Use of Generative AI statement (DRAFT): </w:t>
-      </w:r>
-      <w:r>
-        <w:rPr>
-          <w:rFonts w:ascii="Times New Roman" w:hAnsi="Times New Roman"/>
-          <w:b w:val="0"/>
-          <w:i w:val="0"/>
-          <w:sz w:val="18"/>
-          <w:highlight w:val="yellow"/>
-        </w:rPr>
-        <w:t>Generative AI (Claude Code, Anthropic) was used, directed by team members, for: drafting and debugging the data preprocessing, model training, evaluation, ablation, calibration, and interface code; drafting analysis documents and this report text from computed results and retrieved literature; and literature search/retrieval. AI-generated literature summaries are screening aids only, not evidence of human reading. THE TEAM MUST VERIFY THIS STATEMENT IS ACCURATE AND COMPLETE BEFORE SUBMISSION — full draft in 6_project_progress/statements.md.</w:t>
-      </w:r>
-    </w:p>
     <w:sectPr>
       <w:type w:val="continuous"/>
       <w:pgSz w:w="12240" w:h="15840"/>

</xml_diff>